<commit_message>
chore: add Crypto Observer reports 2026-06-04
</commit_message>
<xml_diff>
--- a/reports/2026/专题研究_20260604.docx
+++ b/reports/2026/专题研究_20260604.docx
@@ -26,7 +26,7 @@
           <w:b w:val="0"/>
           <w:sz w:val="30"/>
         </w:rPr>
-        <w:t>全球区块链监管沙盒与代币化进展：香港、欧洲与塞浦路斯的实践</w:t>
+        <w:t>全球区块链监管沙盒最新进展：香港、欧盟与塞浦路斯的创新实践</w:t>
       </w:r>
     </w:p>
     <w:p>
@@ -41,7 +41,7 @@
           <w:b w:val="0"/>
           <w:sz w:val="28"/>
         </w:rPr>
-        <w:t>· 香港金融管理局（HKMA）于2024年8月启动Project Ensemble沙盒，探索代币化资产交易及批发央行数字货币（wCBDC）结算。</w:t>
+        <w:t>· 香港金融管理局（HKMA）于2024年8月推出Project Ensemble沙盒，探索代币化资产交易与批发央行数字货币（wCBDC）结算。</w:t>
       </w:r>
     </w:p>
     <w:p>
@@ -56,7 +56,7 @@
           <w:b w:val="0"/>
           <w:sz w:val="28"/>
         </w:rPr>
-        <w:t>· 欧洲区块链监管沙盒由欧盟委员会发起，为跨辖区监管对话提供框架，已筛选两批共40个用例，发布最佳实践报告。</w:t>
+        <w:t>· 欧盟区块链沙盒提供跨境监管对话框架，促进创新者与监管机构在保密环境中交流，每年遴选20个用例。</w:t>
       </w:r>
     </w:p>
     <w:p>
@@ -71,7 +71,7 @@
           <w:b w:val="0"/>
           <w:sz w:val="28"/>
         </w:rPr>
-        <w:t>· 塞浦路斯通过国家区块链战略及CySEC创新中心与监管沙盒，成为欧洲区块链创新热点，推动金融科技多元发展。</w:t>
+        <w:t>· 塞浦路斯通过国家区块链战略和监管沙盒，成为欧洲区块链创新热点，吸引众多分布式账本技术（DLT）项目。</w:t>
       </w:r>
     </w:p>
     <w:p>
@@ -97,7 +97,7 @@
           <w:b w:val="0"/>
           <w:sz w:val="28"/>
         </w:rPr>
-        <w:t>《国际区块链法律杂志》第10期于2024年10月发布，汇集了来自马来西亚、德国、荷兰、奥地利、塞浦路斯、英国、美国及香港等多地的区块链与加密资产法律研究。本期重点聚焦全球监管沙盒（Regulatory Sandbox）的实践，涵盖香港金融管理局（HKMA）的Project Ensemble沙盒、欧洲区块链沙盒以及塞浦路斯的监管创新。同时，内容延伸至初始交易所发行（IEO）、OECD加密资产报告框架（CARF）以及加密破产拍卖等前沿议题，为业界提供了跨领域的法律与政策洞察。</w:t>
+        <w:t>《国际区块链法律期刊》第10卷汇集了来自全球的专家文章，聚焦区块链监管沙盒、代币化以及加密资产合规等前沿话题。本专题研究稿提炼其中核心发现，涵盖香港、欧盟、塞浦路斯等司法管辖区的监管创新实践，旨在为从业者提供全面洞察。</w:t>
       </w:r>
     </w:p>
     <w:p>
@@ -113,7 +113,7 @@
           <w:b w:val="0"/>
           <w:sz w:val="28"/>
         </w:rPr>
-        <w:t>首先，来自Norton Rose Fulbright的Etelka Bogardi详细介绍了HKMA于2024年8月28日推出的Project Ensemble沙盒。该沙盒是Project Ensemble的关键组成部分，旨在构建新型金融市场基础设施（FMI），支持代币化资产从创建、交易到结算的完整生命周期。沙盒初期实验围绕固定收益与投资基金、流动性管理、绿色金融以及贸易供应链金融四大主题展开，并计划测试跨境支付功能。值得注意的是，HKMA已与法国央行（BdF）完成系统连接，成功演示了跨境的原子化结算。香港证监会（SFC）将共同领导资产管理行业的代币化倡议，提供监管指引。</w:t>
+        <w:t>香港金融管理局（HKMA）于2024年8月28日启动Project Ensemble沙盒，这是其探索代币化资产交易结算的重要举措。该沙盒作为新型金融基础设施，支持代币化资产从发行、交易到使用代币化银行存款支付，最终通过HKMA发行的批发央行数字货币（wCBDC）进行银行间结算的全生命周期。</w:t>
       </w:r>
     </w:p>
     <w:p>
@@ -129,7 +129,7 @@
           <w:b w:val="0"/>
           <w:sz w:val="28"/>
         </w:rPr>
-        <w:t>Project Ensemble沙盒建立在2024年5月成立的架构社区（Architecture Community）基础之上。该社区由银行、科技公司、监管机构及学术界代表组成，旨在制定行业标准以支持wCBDC（批发央行数字货币）、代币化货币与代币化资产之间的互操作性。社区中的银行已将其代币化存款平台接入沙盒，使参与者能够试验银行间支付对支付（PvP）与交付对支付（DvP）结算。HKMA还计划与国际清算银行创新枢纽香港中心及CBDC专家组合作，进一步推进沙盒的发展。</w:t>
+        <w:t>沙盒首轮实验聚焦四大主题：固定收益与投资基金（债券和基金）、流动性管理（回购和财资管理）、绿色与可持续金融（碳信用和电动车充电站）、贸易与供应链金融。此外，跨境支付功能也被纳入测试范围。香港证券及期货事务监察委员会（SFC）将共同领导资产管理行业的代币化倡议。</w:t>
       </w:r>
     </w:p>
     <w:p>
@@ -145,7 +145,7 @@
           <w:b w:val="0"/>
           <w:sz w:val="28"/>
         </w:rPr>
-        <w:t>展望未来，Project Ensemble沙盒被设计为可扩展模式，初期实验外还将支持多种数字形态的货币与资产。HKMA正积极推动沙盒向生产就绪型FMI演进，为香港未来真实代币化交易提供支持。HKMA与SFC在Project Ensemble上的合作表明，监管机构正致力于推动代币化并建立统一的代币化资产结算标准，这有望提升香港在全球数字金融领域的竞争力。</w:t>
+        <w:t>Project Ensemble沙盒的推出建立在2024年5月成立的架构社区之上。该社区成员包括银行、科技公司、监管机构和学术界，旨在制定行业标准以支持wCBDC、代币化货币和代币化资产之间的互操作性。HKMA表示，将与国际清算银行创新中心香港中心等机构合作，进一步推进沙盒发展。</w:t>
       </w:r>
     </w:p>
     <w:p>
@@ -161,7 +161,7 @@
           <w:b w:val="0"/>
           <w:sz w:val="28"/>
         </w:rPr>
-        <w:t>其次，Bird &amp; Bird律师事务所的Michael Jünemann与Marjolein Geus介绍了欧洲区块链监管沙盒（European Blockchain Sandbox）。该沙盒是欧盟委员会（EC）的一项倡议，旨在建立一个泛欧框架，促进私营与公共领域的区块链/DLT创新者与各国及欧盟层面的监管机构之间的跨境监管对话。与经典的“监管沙盒”不同，欧洲区块链沙盒不提供法律豁免或批准，而是提供一个保密、非正式的对话环境，帮助创新者理解监管要求，同时让监管机构了解前沿技术。</w:t>
+        <w:t>与香港的实践不同，欧盟区块链沙盒并非传统意义上的“监管沙盒”，而是一个为分布式账本技术（DLT）创新者与监管机构提供跨境对话的框架。该沙盒由欧盟委员会发起，由Bird &amp; Bird律所领导的联合体组织，每年从所有欧盟/欧洲经济区（EEA）地区遴选20个创新用例。</w:t>
       </w:r>
     </w:p>
     <w:p>
@@ -177,7 +177,7 @@
           <w:b w:val="0"/>
           <w:sz w:val="28"/>
         </w:rPr>
-        <w:t>欧洲区块链沙盒自2023年起每年筛选20个涉及不同行业与欧洲经济区（EEA）地区的DLT/区块链用例。第一轮（2023年）收到近90份申请，经独立专家评审后选定20个用例，并与超过50个国家及欧盟监管机构进行了对话。对话结果以最佳实践报告形式于2024年6月发布，涵盖GDPR、网络安全、反洗钱（AML）及金融监管等议题。第二轮（2024年）同样完成筛选，第三轮（2025年）的申请预计于2024年底启动。</w:t>
+        <w:t>欧盟沙盒的特点在于不提供法律豁免，也不对用例进行审批，而是通过保密、非正式的对活，帮助创新者理解监管框架，同时让监管机构深入了解新技术。对话涵盖金融监管、数据保护、网络安全、反洗钱（AML）等多个领域。最佳实践和教训以年度报告形式公开，但不会泄露具体用例信息。</w:t>
       </w:r>
     </w:p>
     <w:p>
@@ -193,7 +193,7 @@
           <w:b w:val="0"/>
           <w:sz w:val="28"/>
         </w:rPr>
-        <w:t>欧洲区块链沙盒的优势体现在多方面：对于参与者，可获得专业法律与监管建议，与多国监管机构进行建设性对话，且无需缴纳费用；对于监管机构，能够就具体用例探讨跨境监管问题，分享经验，提升对前沿技术的理解，并有机会获评“最具创新力监管机构”。沙盒的反馈普遍积极，几乎所有参与的监管机构都表达了继续参与的意愿。这一机制有助于在欧盟/EEA内部形成对DLT监管的共识，为创新企业提供法律确定性。</w:t>
+        <w:t>参与欧盟沙盒对创新者和监管机构均有裨益。创新者获得专业法律建议，并与多国监管机构建立联系；监管机构则能交流跨境监管经验，提升对前沿技术的认知，甚至竞争“最具创新监管机构”称号。第一轮对话反馈非常积极，几乎所有监管机构都表示愿意继续参与。</w:t>
       </w:r>
     </w:p>
     <w:p>
@@ -209,7 +209,7 @@
           <w:b w:val="0"/>
           <w:sz w:val="28"/>
         </w:rPr>
-        <w:t>随后，DS Partners律师事务所的Mikaela Kantor探讨了塞浦路斯的区块链监管进展。塞浦路斯凭借其战略地理位置、欧盟成员国身份以及对新兴技术的友好态度，已成为区块链项目的热点管辖区之一。2019年，塞浦路斯通过了国家区块链战略（National Blockchain Strategy），为后续发展奠定基础。2024年6月，塞浦路斯证券交易委员会（CySEC）推出监管沙盒，这是其创新中心（Innovation Hub）的一部分，旨在支持基于区块链的金融产品创新。</w:t>
+        <w:t>塞浦路斯凭借其地理位置和欧盟成员国身份，正成为区块链创新热点。2018年该国签署欧洲区块链伙伴关系，2019年采用国家区块链战略，为后续发展奠定基础。塞浦路斯证券交易委员会（CySEC）推出的创新中心和监管沙盒，进一步吸引了大量DLT项目。</w:t>
       </w:r>
     </w:p>
     <w:p>
@@ -225,7 +225,7 @@
           <w:b w:val="0"/>
           <w:sz w:val="28"/>
         </w:rPr>
-        <w:t>塞浦路斯在区块链法律框架方面也在积极立法。2021年9月，财政部就分布式账本技术（DLT）法案（DLT Law）草案公开征求意见，该法案旨在以技术中立方式平衡创新促进与消费者保护、反洗钱（AML）要求。尽管该法案仍在制定中，但已表明塞浦路斯建立透明、安全监管环境的决心。此外，塞浦路斯参与了欧洲区块链伙伴关系（EBP）及南地中海国家DLT宣言，加强了区域数字合作。</w:t>
+        <w:t>2021年，塞浦路斯财政部就拟议的DLT法律草案进行公开咨询，旨在以技术中立的方式平衡创新促进与消费者保护、反洗钱。该法律草案虽仍在制定中，但已标志着塞浦路斯向确立区块链监管框架迈出关键一步。CySEC的监管沙盒于2024年6月启动，为金融科技企业提供受控测试环境。</w:t>
       </w:r>
     </w:p>
     <w:p>
@@ -241,7 +241,7 @@
           <w:b w:val="0"/>
           <w:sz w:val="28"/>
         </w:rPr>
-        <w:t>本期杂志还涵盖了其他重要议题：来自GSR Markets的作者讨论了欧盟、英国和美国在加密资产跨境市场准入方面的差异，并提出了一套原则以构建安全且鼓励创新的框架。马来西亚的Celebrus Advisory与GLT Law的专家概述了马来西亚初始交易所发行（IEO）的监管现状，包括其与伊斯兰教法的兼容性。IEO作为ICO的变体，通过数字资产交易所进行，马来西亚的监管将持续完善。</w:t>
+        <w:t>塞浦路斯国家区块链战略强调在公共和私营部门利用区块链提升透明度、推动经济增长。疫情期间，政府发起多项基于DLT的解决方案征集，涉及医疗、企业治理等领域，许多成果已落地应用。不过，法律框架的最终确定仍需时间，如何在国际监管标准与本土创新之间取得平衡仍是挑战。</w:t>
       </w:r>
     </w:p>
     <w:p>
@@ -257,7 +257,7 @@
           <w:b w:val="0"/>
           <w:sz w:val="28"/>
         </w:rPr>
-        <w:t>奥地利Taxbit的Max Bernt博士剖析了OECD加密资产报告框架（CARF）的关键组成部分。CARF获得G20背书及60多个司法管辖区支持，为加密资产向税务机关报告建立了标准化方法。Bernt指出，CARF并非直接用于计算加密税负，而是通过风险评估帮助税务机关识别高风险案例和潜在逃税行为，从而加强数字资产领域的税务合规。这一框架将对全球税务管理产生深远影响。</w:t>
+        <w:t>跨境市场准入是加密资产行业的又一核心议题。GSR Markets的文章分析了欧盟、英国和美国的不同做法，指出当前碎片化的监管环境阻碍了创新。作者提出建立安全且有利于创新的跨境准入框架的原则，强调需反映加密资产的全球性。</w:t>
       </w:r>
     </w:p>
     <w:p>
@@ -273,7 +273,7 @@
           <w:b w:val="0"/>
           <w:sz w:val="28"/>
         </w:rPr>
-        <w:t>美国McDermott Will &amp; Emery律师事务所的律师们分析了加密破产交易的最新动态。由于监管变化、资产价值波动及交易复杂性，加密资产重组需要灵活应对。不确定性要求特别关注财务损失缓解措施。文章以实例说明了加密火销售（Crypto Fire Sales）及破产拍卖中的关键考量，为从业者提供了实用指导。最后，本期收录了Clifford Chance与GBBC联合举办的“资产与基金代币化”专题讨论的播客链接。</w:t>
+        <w:t>在马来西亚，初始交易所发行（IEO）的监管框架正逐步完善。文章概述了马来西亚对IEO的现行规定，并考虑了伊斯兰教法合规性。作者预测，马来西亚将针对数字代币的全生命周期和资产服务基础设施出台更全面的法规。</w:t>
       </w:r>
     </w:p>
     <w:p>
@@ -289,7 +289,7 @@
           <w:b w:val="0"/>
           <w:sz w:val="28"/>
         </w:rPr>
-        <w:t>综合来看，本期《国际区块链法律杂志》展现了全球区块链监管的多元图景：香港通过Project Ensemble推动代币化与CBDC结算；欧洲通过沙盒机制促进跨境监管对话；塞浦路斯则结合国家战略与沙盒构建创新生态。同时，IEO、CARF及破产等议题揭示了监管框架的持续演变。这些进展表明，全球监管机构正努力在创新与风险防控之间寻求平衡，区块链技术的法律确定性正在逐步增强。</w:t>
+        <w:t>税务合规方面，经济合作与发展组织（OECD）的加密资产报告框架（CARF）受到关注。Taxbit Austria的专家指出，CARF并非用于计算加密税负，而是为税务机关提供风险评估工具，帮助识别高风险案例和潜在逃税行为。该框架已获得G20背书及60多个司法管辖区支持。</w:t>
       </w:r>
     </w:p>
     <w:p>
@@ -305,7 +305,103 @@
           <w:b w:val="0"/>
           <w:sz w:val="28"/>
         </w:rPr>
-        <w:t>可以预见，随着代币化资产、稳定币及DeFi等领域的快速发展，监管沙盒作为试验田的角色将愈发重要。香港、欧洲和塞浦路斯的经验为其他司法管辖区提供了可借鉴的模式。未来，跨境协调与标准统一将成为关键挑战，而国际组织如OECD、BIS的参与将推动全球监管框架的趋同。对于从业者而言，深入了解各辖区监管动态并积极参与对话，将是把握机遇、规避风险的必要路径。</w:t>
+        <w:t>美国加密破产交易领域呈现独特复杂性。文章指出，由于监管变化、资产价值波动和交易复杂性，加密资产重组需要灵活应对不断变化的目标。时间不确定性要求特别考虑以减轻潜在财务损失，这在美国破产法实践中尤为突出。</w:t>
+      </w:r>
+    </w:p>
+    <w:p>
+      <w:pPr>
+        <w:pStyle w:val="正文内容"/>
+        <w:spacing w:before="0" w:after="0" w:line="240" w:lineRule="auto"/>
+        <w:ind w:left="0" w:right="0" w:firstLine="560"/>
+        <w:jc w:val="both"/>
+      </w:pPr>
+      <w:r>
+        <w:rPr>
+          <w:rFonts w:ascii="Times New Roman" w:hAnsi="Times New Roman" w:cs="Times New Roman" w:eastAsia="仿宋"/>
+          <w:b w:val="0"/>
+          <w:sz w:val="28"/>
+        </w:rPr>
+        <w:t>本期期刊还包含克利福德·钱斯（Clifford Chance）与GBBC的研讨会记录，主题为“资产和基金代币化”，探讨了代币化在法律和操作层面的挑战。代币化被视为提高资产流动性和效率的途径，但需要在监管框架下审慎推进。</w:t>
+      </w:r>
+    </w:p>
+    <w:p>
+      <w:pPr>
+        <w:pStyle w:val="正文内容"/>
+        <w:spacing w:before="0" w:after="0" w:line="240" w:lineRule="auto"/>
+        <w:ind w:left="0" w:right="0" w:firstLine="560"/>
+        <w:jc w:val="both"/>
+      </w:pPr>
+      <w:r>
+        <w:rPr>
+          <w:rFonts w:ascii="Times New Roman" w:hAnsi="Times New Roman" w:cs="Times New Roman" w:eastAsia="仿宋"/>
+          <w:b w:val="0"/>
+          <w:sz w:val="28"/>
+        </w:rPr>
+        <w:t>综合来看，全球各司法管辖区在区块链监管沙盒方面呈现出多样化的路径。香港专注于代币化金融基础设施，欧盟强调跨境对话合作，塞浦路斯则通过国家战略和本土沙盒吸引创新。这些实践共同指向一个趋势：监管正从被动应对转向主动引导创新。</w:t>
+      </w:r>
+    </w:p>
+    <w:p>
+      <w:pPr>
+        <w:pStyle w:val="正文内容"/>
+        <w:spacing w:before="0" w:after="0" w:line="240" w:lineRule="auto"/>
+        <w:ind w:left="0" w:right="0" w:firstLine="560"/>
+        <w:jc w:val="both"/>
+      </w:pPr>
+      <w:r>
+        <w:rPr>
+          <w:rFonts w:ascii="Times New Roman" w:hAnsi="Times New Roman" w:cs="Times New Roman" w:eastAsia="仿宋"/>
+          <w:b w:val="0"/>
+          <w:sz w:val="28"/>
+        </w:rPr>
+        <w:t>未来，香港Project Ensemble沙盒有望发展为生产就绪的金融基础设施，支持真实资金交易。欧盟将进一步深化对话，探讨DLT与人工智能（AI）或物联网（IoT）的组合应用。塞浦路斯则有望在DLT法律出台后确立更为清晰的监管地位。</w:t>
+      </w:r>
+    </w:p>
+    <w:p>
+      <w:pPr>
+        <w:pStyle w:val="正文内容"/>
+        <w:spacing w:before="0" w:after="0" w:line="240" w:lineRule="auto"/>
+        <w:ind w:left="0" w:right="0" w:firstLine="560"/>
+        <w:jc w:val="both"/>
+      </w:pPr>
+      <w:r>
+        <w:rPr>
+          <w:rFonts w:ascii="Times New Roman" w:hAnsi="Times New Roman" w:cs="Times New Roman" w:eastAsia="仿宋"/>
+          <w:b w:val="0"/>
+          <w:sz w:val="28"/>
+        </w:rPr>
+        <w:t>对于加密资产企业而言，理解并适应这些不同的监管沙盒机制至关重要。无论是利用香港的wCBDC试点，还是参与欧盟的监管对话，都能在合规前提下加速创新。监管沙盒作为“安全港”，为探索新型商业模式提供了宝贵的缓冲空间。</w:t>
+      </w:r>
+    </w:p>
+    <w:p>
+      <w:pPr>
+        <w:pStyle w:val="正文内容"/>
+        <w:spacing w:before="0" w:after="0" w:line="240" w:lineRule="auto"/>
+        <w:ind w:left="0" w:right="0" w:firstLine="560"/>
+        <w:jc w:val="both"/>
+      </w:pPr>
+      <w:r>
+        <w:rPr>
+          <w:rFonts w:ascii="Times New Roman" w:hAnsi="Times New Roman" w:cs="Times New Roman" w:eastAsia="仿宋"/>
+          <w:b w:val="0"/>
+          <w:sz w:val="28"/>
+        </w:rPr>
+        <w:t>值得一提的是，尽管各沙盒具体设计不同，但均强调与监管机构的早期互动。这种互动不仅降低了合规不确定性，还帮助政策制定者了解技术前沿。期刊中的案例表明，成功的沙盒需要创新者、监管者和学术界的共同参与。</w:t>
+      </w:r>
+    </w:p>
+    <w:p>
+      <w:pPr>
+        <w:pStyle w:val="正文内容"/>
+        <w:spacing w:before="0" w:after="0" w:line="240" w:lineRule="auto"/>
+        <w:ind w:left="0" w:right="0" w:firstLine="560"/>
+        <w:jc w:val="both"/>
+      </w:pPr>
+      <w:r>
+        <w:rPr>
+          <w:rFonts w:ascii="Times New Roman" w:hAnsi="Times New Roman" w:cs="Times New Roman" w:eastAsia="仿宋"/>
+          <w:b w:val="0"/>
+          <w:sz w:val="28"/>
+        </w:rPr>
+        <w:t>综上所述，区块链监管沙盒已成为全球金融科技生态不可或缺的组成部分。通过香港Project Ensemble、欧盟区块链沙盒和塞浦路斯等地的实践，我们看到监管创新正在为分布式账本技术释放潜力铺平道路。各方应持续关注这些动态，把握合规与创新之间的平衡。</w:t>
       </w:r>
     </w:p>
     <w:p>

</xml_diff>